<commit_message>
docs: finalize verified owner requirements and SRS layout
</commit_message>
<xml_diff>
--- a/docs/Knitwork-SRS.docx
+++ b/docs/Knitwork-SRS.docx
@@ -79,7 +79,7 @@
         <w:rPr>
           <w:b w:val="0"/>
         </w:rPr>
-        <w:t>Owners list and manage their resources and review associated requests, condition reports and incidents.</w:t>
+        <w:t>Verified owners list and manage their resources and review associated requests, condition reports and incidents.</w:t>
       </w:r>
     </w:p>
     <w:p>
@@ -152,7 +152,7 @@
         <w:rPr>
           <w:b w:val="0"/>
         </w:rPr>
-        <w:t>FR02 Owners shall list a resource with category, description, location, operating hours, availability date window, maximum session duration, weekly usage cap, training requirements, operator policy, usage conditions, hourly rate and deposit terms. Resources can be paused for maintenance.</w:t>
+        <w:t>FR02 Verified owners or authorised centre staff shall list a resource with category, description, location, operating hours, availability date window, maximum session duration, weekly usage cap, training requirements, operator policy, usage conditions, hourly rate and deposit terms. Resources can be paused for maintenance.</w:t>
       </w:r>
     </w:p>
     <w:p>
@@ -937,7 +937,7 @@
     <w:qFormat/>
     <w:rsid w:val="00FC693F"/>
     <w:pPr>
-      <w:spacing w:after="140" w:line="264" w:lineRule="auto"/>
+      <w:spacing w:after="100" w:line="252" w:lineRule="auto"/>
     </w:pPr>
     <w:rPr>
       <w:rFonts w:ascii="Calibri" w:hAnsi="Calibri"/>
@@ -1000,7 +1000,7 @@
     <w:pPr>
       <w:keepNext/>
       <w:keepLines/>
-      <w:spacing w:before="300" w:after="160"/>
+      <w:spacing w:before="240" w:after="160"/>
       <w:outlineLvl w:val="0"/>
     </w:pPr>
     <w:rPr>
@@ -1008,7 +1008,7 @@
       <w:b/>
       <w:bCs/>
       <w:color w:val="000000"/>
-      <w:sz w:val="30"/>
+      <w:sz w:val="28"/>
       <w:szCs w:val="28"/>
     </w:rPr>
   </w:style>
@@ -1024,7 +1024,7 @@
     <w:pPr>
       <w:keepNext/>
       <w:keepLines/>
-      <w:spacing w:before="300" w:after="160"/>
+      <w:spacing w:before="240" w:after="160"/>
       <w:outlineLvl w:val="1"/>
     </w:pPr>
     <w:rPr>
@@ -1048,7 +1048,7 @@
     <w:pPr>
       <w:keepNext/>
       <w:keepLines/>
-      <w:spacing w:before="300" w:after="160"/>
+      <w:spacing w:before="240" w:after="160"/>
       <w:outlineLvl w:val="2"/>
     </w:pPr>
     <w:rPr>

</xml_diff>